<commit_message>
Final update: Add 6th member and remove group name
</commit_message>
<xml_diff>
--- a/baocao.docx
+++ b/baocao.docx
@@ -7,6 +7,8 @@
         <w:jc w:val="center"/>
         <w:rPr>
           <w:rFonts w:ascii="Times New Roman" w:hAnsi="Times New Roman" w:cs="Times New Roman"/>
+          <w:sz w:val="28"/>
+          <w:szCs w:val="28"/>
           <w:lang w:val="en-US"/>
         </w:rPr>
       </w:pPr>
@@ -15,15 +17,17 @@
           <w:rFonts w:ascii="Times New Roman" w:hAnsi="Times New Roman" w:cs="Times New Roman"/>
           <w:b/>
           <w:bCs/>
-          <w:sz w:val="40"/>
-          <w:szCs w:val="40"/>
-          <w:lang w:val="en-US"/>
-        </w:rPr>
-        <w:t>BÁO CÁO BÀI TẬP NHÓM</w:t>
-      </w:r>
-      <w:r>
-        <w:rPr>
-          <w:rFonts w:ascii="Times New Roman" w:hAnsi="Times New Roman" w:cs="Times New Roman"/>
+          <w:sz w:val="44"/>
+          <w:szCs w:val="44"/>
+          <w:lang w:val="en-US"/>
+        </w:rPr>
+        <w:t>BÁO CÁO BÀI TẬP</w:t>
+      </w:r>
+      <w:r>
+        <w:rPr>
+          <w:rFonts w:ascii="Times New Roman" w:hAnsi="Times New Roman" w:cs="Times New Roman"/>
+          <w:sz w:val="28"/>
+          <w:szCs w:val="28"/>
           <w:lang w:val="en-US"/>
         </w:rPr>
         <w:br/>
@@ -33,6 +37,8 @@
           <w:rFonts w:ascii="Times New Roman" w:hAnsi="Times New Roman" w:cs="Times New Roman"/>
           <w:b/>
           <w:bCs/>
+          <w:sz w:val="28"/>
+          <w:szCs w:val="28"/>
           <w:lang w:val="en-US"/>
         </w:rPr>
         <w:t>Môn:</w:t>
@@ -40,6 +46,8 @@
       <w:r>
         <w:rPr>
           <w:rFonts w:ascii="Times New Roman" w:hAnsi="Times New Roman" w:cs="Times New Roman"/>
+          <w:sz w:val="28"/>
+          <w:szCs w:val="28"/>
           <w:lang w:val="en-US"/>
         </w:rPr>
         <w:t xml:space="preserve"> Lịch sử 11</w:t>
@@ -47,6 +55,8 @@
       <w:r>
         <w:rPr>
           <w:rFonts w:ascii="Times New Roman" w:hAnsi="Times New Roman" w:cs="Times New Roman"/>
+          <w:sz w:val="28"/>
+          <w:szCs w:val="28"/>
           <w:lang w:val="en-US"/>
         </w:rPr>
         <w:br/>
@@ -56,6 +66,8 @@
           <w:rFonts w:ascii="Times New Roman" w:hAnsi="Times New Roman" w:cs="Times New Roman"/>
           <w:b/>
           <w:bCs/>
+          <w:sz w:val="28"/>
+          <w:szCs w:val="28"/>
           <w:lang w:val="en-US"/>
         </w:rPr>
         <w:t>Chủ đề:</w:t>
@@ -63,6 +75,8 @@
       <w:r>
         <w:rPr>
           <w:rFonts w:ascii="Times New Roman" w:hAnsi="Times New Roman" w:cs="Times New Roman"/>
+          <w:sz w:val="28"/>
+          <w:szCs w:val="28"/>
           <w:lang w:val="en-US"/>
         </w:rPr>
         <w:t xml:space="preserve"> Ứng dụng AI và Bản đồ số vào thuyết trình "Phong trào Tây Sơn"</w:t>
@@ -70,6 +84,8 @@
       <w:r>
         <w:rPr>
           <w:rFonts w:ascii="Times New Roman" w:hAnsi="Times New Roman" w:cs="Times New Roman"/>
+          <w:sz w:val="28"/>
+          <w:szCs w:val="28"/>
           <w:lang w:val="en-US"/>
         </w:rPr>
         <w:br/>
@@ -79,53 +95,38 @@
           <w:rFonts w:ascii="Times New Roman" w:hAnsi="Times New Roman" w:cs="Times New Roman"/>
           <w:b/>
           <w:bCs/>
-          <w:lang w:val="en-US"/>
-        </w:rPr>
-        <w:t>Nhóm thực hiện:</w:t>
-      </w:r>
-      <w:r>
-        <w:rPr>
-          <w:rFonts w:ascii="Times New Roman" w:hAnsi="Times New Roman" w:cs="Times New Roman"/>
-          <w:lang w:val="en-US"/>
-        </w:rPr>
-        <w:t xml:space="preserve"> Nhóm 8</w:t>
-      </w:r>
-      <w:r>
-        <w:rPr>
-          <w:rFonts w:ascii="Times New Roman" w:hAnsi="Times New Roman" w:cs="Times New Roman"/>
-          <w:lang w:val="en-US"/>
-        </w:rPr>
-        <w:br/>
-      </w:r>
+          <w:sz w:val="28"/>
+          <w:szCs w:val="28"/>
+          <w:lang w:val="en-US"/>
+        </w:rPr>
+        <w:t>Thành viên thực hiện:</w:t>
+      </w:r>
+      <w:r>
+        <w:rPr>
+          <w:rFonts w:ascii="Times New Roman" w:hAnsi="Times New Roman" w:cs="Times New Roman"/>
+          <w:sz w:val="28"/>
+          <w:szCs w:val="28"/>
+          <w:lang w:val="en-US"/>
+        </w:rPr>
+        <w:t xml:space="preserve"> Nguyễn Ngọc Phước (Nhóm trưởng), Hoàng Minh, Trần Anh Minh, Nguyễn Công Trí, Hoàng Minh Hùng, Nguyễn Hoàng Gia Bảo.</w:t>
+      </w:r>
+    </w:p>
+    <w:p>
+      <w:pPr>
+        <w:rPr>
+          <w:rFonts w:ascii="Times New Roman" w:hAnsi="Times New Roman" w:cs="Times New Roman"/>
+          <w:sz w:val="28"/>
+          <w:szCs w:val="28"/>
+          <w:lang w:val="en-US"/>
+        </w:rPr>
+      </w:pPr>
       <w:r>
         <w:rPr>
           <w:rFonts w:ascii="Times New Roman" w:hAnsi="Times New Roman" w:cs="Times New Roman"/>
           <w:b/>
           <w:bCs/>
-          <w:lang w:val="en-US"/>
-        </w:rPr>
-        <w:t>Thành viên:</w:t>
-      </w:r>
-      <w:r>
-        <w:rPr>
-          <w:rFonts w:ascii="Times New Roman" w:hAnsi="Times New Roman" w:cs="Times New Roman"/>
-          <w:lang w:val="en-US"/>
-        </w:rPr>
-        <w:t xml:space="preserve"> Nguyễn Ngọc Phước (NT), Hoàng Minh, Trần Anh Minh, Nguyễn Công Trí, Nguyễn Hoàng Gia Bảo.</w:t>
-      </w:r>
-    </w:p>
-    <w:p>
-      <w:pPr>
-        <w:rPr>
-          <w:rFonts w:ascii="Times New Roman" w:hAnsi="Times New Roman" w:cs="Times New Roman"/>
-          <w:lang w:val="en-US"/>
-        </w:rPr>
-      </w:pPr>
-      <w:r>
-        <w:rPr>
-          <w:rFonts w:ascii="Times New Roman" w:hAnsi="Times New Roman" w:cs="Times New Roman"/>
-          <w:b/>
-          <w:bCs/>
+          <w:sz w:val="28"/>
+          <w:szCs w:val="28"/>
           <w:lang w:val="en-US"/>
         </w:rPr>
         <w:t>I. MỤC TIÊU VÀ PHƯƠNG PHÁP TIẾP CẬN</w:t>
@@ -139,6 +140,8 @@
         </w:numPr>
         <w:rPr>
           <w:rFonts w:ascii="Times New Roman" w:hAnsi="Times New Roman" w:cs="Times New Roman"/>
+          <w:sz w:val="28"/>
+          <w:szCs w:val="28"/>
           <w:lang w:val="en-US"/>
         </w:rPr>
       </w:pPr>
@@ -147,6 +150,8 @@
           <w:rFonts w:ascii="Times New Roman" w:hAnsi="Times New Roman" w:cs="Times New Roman"/>
           <w:b/>
           <w:bCs/>
+          <w:sz w:val="28"/>
+          <w:szCs w:val="28"/>
           <w:lang w:val="en-US"/>
         </w:rPr>
         <w:t>Mục tiêu:</w:t>
@@ -154,9 +159,11 @@
       <w:r>
         <w:rPr>
           <w:rFonts w:ascii="Times New Roman" w:hAnsi="Times New Roman" w:cs="Times New Roman"/>
-          <w:lang w:val="en-US"/>
-        </w:rPr>
-        <w:t xml:space="preserve"> Xây dựng một sản phẩm thuyết trình trực quan, sinh động về Phong trào Tây Sơn (Mục 3, Bài 8, SGK Lịch sử 11 - Kết nối tri thức). Thay vì các slide tĩnh truyền thống, nhóm ứng dụng công nghệ web (HTML/CSS/JS) để tạo ra một trang web thuyết trình tương tác, tích hợp bản đồ vệ tinh số.</w:t>
+          <w:sz w:val="28"/>
+          <w:szCs w:val="28"/>
+          <w:lang w:val="en-US"/>
+        </w:rPr>
+        <w:t xml:space="preserve"> Xây dựng một sản phẩm thuyết trình trực quan, sinh động về Phong trào Tây Sơn (Mục 3, Bài 8, SGK Lịch sử 11 - Kết nối tri thức). Thay vì các slide tĩnh truyền thống, chúng em ứng dụng công nghệ web (HTML/CSS/JS) để tạo ra một trang web thuyết trình tương tác, tích hợp bản đồ vệ tinh số.</w:t>
       </w:r>
     </w:p>
     <w:p>
@@ -167,6 +174,8 @@
         </w:numPr>
         <w:rPr>
           <w:rFonts w:ascii="Times New Roman" w:hAnsi="Times New Roman" w:cs="Times New Roman"/>
+          <w:sz w:val="28"/>
+          <w:szCs w:val="28"/>
           <w:lang w:val="en-US"/>
         </w:rPr>
       </w:pPr>
@@ -175,6 +184,8 @@
           <w:rFonts w:ascii="Times New Roman" w:hAnsi="Times New Roman" w:cs="Times New Roman"/>
           <w:b/>
           <w:bCs/>
+          <w:sz w:val="28"/>
+          <w:szCs w:val="28"/>
           <w:lang w:val="en-US"/>
         </w:rPr>
         <w:t>Phương pháp tiếp cận:</w:t>
@@ -182,6 +193,8 @@
       <w:r>
         <w:rPr>
           <w:rFonts w:ascii="Times New Roman" w:hAnsi="Times New Roman" w:cs="Times New Roman"/>
+          <w:sz w:val="28"/>
+          <w:szCs w:val="28"/>
           <w:lang w:val="en-US"/>
         </w:rPr>
         <w:t xml:space="preserve"> Sử dụng Trí tuệ nhân tạo (AI - ChatGPT) làm trợ lý đắc lực trong việc viết mã nguồn, gỡ lỗi và tối ưu hóa giao diện. Kết hợp với thư viện bản đồ mã nguồn mở Leaflet để tái hiện lại các bước di chuyển của quân Tây Sơn.</w:t>
@@ -191,6 +204,8 @@
       <w:pPr>
         <w:rPr>
           <w:rFonts w:ascii="Times New Roman" w:hAnsi="Times New Roman" w:cs="Times New Roman"/>
+          <w:sz w:val="28"/>
+          <w:szCs w:val="28"/>
           <w:lang w:val="en-US"/>
         </w:rPr>
       </w:pPr>
@@ -199,6 +214,8 @@
           <w:rFonts w:ascii="Times New Roman" w:hAnsi="Times New Roman" w:cs="Times New Roman"/>
           <w:b/>
           <w:bCs/>
+          <w:sz w:val="28"/>
+          <w:szCs w:val="28"/>
           <w:lang w:val="en-US"/>
         </w:rPr>
         <w:t>II. NỘI DUNG THỰC HIỆN</w:t>
@@ -206,6 +223,8 @@
       <w:r>
         <w:rPr>
           <w:rFonts w:ascii="Times New Roman" w:hAnsi="Times New Roman" w:cs="Times New Roman"/>
+          <w:sz w:val="28"/>
+          <w:szCs w:val="28"/>
           <w:lang w:val="en-US"/>
         </w:rPr>
         <w:br/>
@@ -220,6 +239,8 @@
         </w:numPr>
         <w:rPr>
           <w:rFonts w:ascii="Times New Roman" w:hAnsi="Times New Roman" w:cs="Times New Roman"/>
+          <w:sz w:val="28"/>
+          <w:szCs w:val="28"/>
           <w:lang w:val="en-US"/>
         </w:rPr>
       </w:pPr>
@@ -228,6 +249,8 @@
           <w:rFonts w:ascii="Times New Roman" w:hAnsi="Times New Roman" w:cs="Times New Roman"/>
           <w:b/>
           <w:bCs/>
+          <w:sz w:val="28"/>
+          <w:szCs w:val="28"/>
           <w:lang w:val="en-US"/>
         </w:rPr>
         <w:t>Bối cảnh lịch sử:</w:t>
@@ -235,9 +258,11 @@
       <w:r>
         <w:rPr>
           <w:rFonts w:ascii="Times New Roman" w:hAnsi="Times New Roman" w:cs="Times New Roman"/>
-          <w:lang w:val="en-US"/>
-        </w:rPr>
-        <w:t xml:space="preserve"> Tái hiện tình hình chính quyền chúa Nguyễn khủng hoảng vào giữa thế kỷ XVIII. Sự bùng nổ của khởi nghĩa Tây Sơn vào mùa xuân năm 1771 tại An Khê (Gia Lai).</w:t>
+          <w:sz w:val="28"/>
+          <w:szCs w:val="28"/>
+          <w:lang w:val="en-US"/>
+        </w:rPr>
+        <w:t xml:space="preserve"> Tái hiện tình hình khủng hoảng của chính quyền Lê - Trịnh ở Đàng Ngoài và chúa Nguyễn ở Đàng Trong vào giữa thế kỷ XVIII. Sự bùng nổ của khởi nghĩa Tây Sơn vào năm 1771 tại Tây Sơn thượng đạo (An Khê).</w:t>
       </w:r>
     </w:p>
     <w:p>
@@ -248,6 +273,8 @@
         </w:numPr>
         <w:rPr>
           <w:rFonts w:ascii="Times New Roman" w:hAnsi="Times New Roman" w:cs="Times New Roman"/>
+          <w:sz w:val="28"/>
+          <w:szCs w:val="28"/>
           <w:lang w:val="en-US"/>
         </w:rPr>
       </w:pPr>
@@ -256,6 +283,8 @@
           <w:rFonts w:ascii="Times New Roman" w:hAnsi="Times New Roman" w:cs="Times New Roman"/>
           <w:b/>
           <w:bCs/>
+          <w:sz w:val="28"/>
+          <w:szCs w:val="28"/>
           <w:lang w:val="en-US"/>
         </w:rPr>
         <w:t>Dòng thời gian:</w:t>
@@ -263,9 +292,11 @@
       <w:r>
         <w:rPr>
           <w:rFonts w:ascii="Times New Roman" w:hAnsi="Times New Roman" w:cs="Times New Roman"/>
-          <w:lang w:val="en-US"/>
-        </w:rPr>
-        <w:t xml:space="preserve"> Hệ thống hóa 8 mốc sự kiện quan trọng từ năm 1771 đến 1789 bằng giao diện timeline trượt ngang hiện đại.</w:t>
+          <w:sz w:val="28"/>
+          <w:szCs w:val="28"/>
+          <w:lang w:val="en-US"/>
+        </w:rPr>
+        <w:t xml:space="preserve"> Hệ thống hóa 8 mốc sự kiện quan trọng từ năm 1771 đến 1789.</w:t>
       </w:r>
     </w:p>
     <w:p>
@@ -276,6 +307,8 @@
         </w:numPr>
         <w:rPr>
           <w:rFonts w:ascii="Times New Roman" w:hAnsi="Times New Roman" w:cs="Times New Roman"/>
+          <w:sz w:val="28"/>
+          <w:szCs w:val="28"/>
           <w:lang w:val="en-US"/>
         </w:rPr>
       </w:pPr>
@@ -284,6 +317,8 @@
           <w:rFonts w:ascii="Times New Roman" w:hAnsi="Times New Roman" w:cs="Times New Roman"/>
           <w:b/>
           <w:bCs/>
+          <w:sz w:val="28"/>
+          <w:szCs w:val="28"/>
           <w:lang w:val="en-US"/>
         </w:rPr>
         <w:t>Diễn biến:</w:t>
@@ -291,9 +326,11 @@
       <w:r>
         <w:rPr>
           <w:rFonts w:ascii="Times New Roman" w:hAnsi="Times New Roman" w:cs="Times New Roman"/>
-          <w:lang w:val="en-US"/>
-        </w:rPr>
-        <w:t xml:space="preserve"> Ứng dụng bản đồ vệ tinh số (Digital Map). Người thuyết trình có thể tương tác để mở từng giai đoạn, hệ thống sẽ tự động vẽ đường hành quân bằng hiệu ứng mũi tên chuyển động (Ant Path), kết hợp với camera bay tới các địa danh lịch sử (An Khê, Quy Nhơn, Rạch Gầm, Phú Xuân, Thăng Long, Ngọc Hồi - Đống Đa).</w:t>
+          <w:sz w:val="28"/>
+          <w:szCs w:val="28"/>
+          <w:lang w:val="en-US"/>
+        </w:rPr>
+        <w:t xml:space="preserve"> Ứng dụng bản đồ vệ tinh số. Hệ thống tự động vẽ đường hành quân bằng hiệu ứng mũi tên chuyển động, kết hợp camera bay tới các địa danh lịch sử (An Khê, Quy Nhơn, Rạch Gầm, Phú Xuân, Thăng Long, Ngọc Hồi - Đống Đa).</w:t>
       </w:r>
     </w:p>
     <w:p>
@@ -304,6 +341,8 @@
         </w:numPr>
         <w:rPr>
           <w:rFonts w:ascii="Times New Roman" w:hAnsi="Times New Roman" w:cs="Times New Roman"/>
+          <w:sz w:val="28"/>
+          <w:szCs w:val="28"/>
           <w:lang w:val="en-US"/>
         </w:rPr>
       </w:pPr>
@@ -312,6 +351,8 @@
           <w:rFonts w:ascii="Times New Roman" w:hAnsi="Times New Roman" w:cs="Times New Roman"/>
           <w:b/>
           <w:bCs/>
+          <w:sz w:val="28"/>
+          <w:szCs w:val="28"/>
           <w:lang w:val="en-US"/>
         </w:rPr>
         <w:t>Kết quả - Ý nghĩa:</w:t>
@@ -319,15 +360,19 @@
       <w:r>
         <w:rPr>
           <w:rFonts w:ascii="Times New Roman" w:hAnsi="Times New Roman" w:cs="Times New Roman"/>
-          <w:lang w:val="en-US"/>
-        </w:rPr>
-        <w:t xml:space="preserve"> Đúc kết thành tựu lật đổ 3 tập đoàn phong kiến, thống nhất đất nước và ý nghĩa bảo vệ độc lập dân tộc trước quân Xiêm, Thanh.</w:t>
+          <w:sz w:val="28"/>
+          <w:szCs w:val="28"/>
+          <w:lang w:val="en-US"/>
+        </w:rPr>
+        <w:t xml:space="preserve"> Đúc kết việc lật đổ chính quyền chúa Nguyễn, tập đoàn Lê - Trịnh, chấm dứt triều Lê; đánh đuổi quân Xiêm, Thanh, bảo vệ nền độc lập dân tộc.</w:t>
       </w:r>
     </w:p>
     <w:p>
       <w:pPr>
         <w:rPr>
           <w:rFonts w:ascii="Times New Roman" w:hAnsi="Times New Roman" w:cs="Times New Roman"/>
+          <w:sz w:val="28"/>
+          <w:szCs w:val="28"/>
           <w:lang w:val="en-US"/>
         </w:rPr>
       </w:pPr>
@@ -336,6 +381,8 @@
           <w:rFonts w:ascii="Times New Roman" w:hAnsi="Times New Roman" w:cs="Times New Roman"/>
           <w:b/>
           <w:bCs/>
+          <w:sz w:val="28"/>
+          <w:szCs w:val="28"/>
           <w:lang w:val="en-US"/>
         </w:rPr>
         <w:t>III. QUÁ TRÌNH ỨNG DỤNG AI VÀ CÔNG NGHỆ</w:t>
@@ -349,6 +396,8 @@
         </w:numPr>
         <w:rPr>
           <w:rFonts w:ascii="Times New Roman" w:hAnsi="Times New Roman" w:cs="Times New Roman"/>
+          <w:sz w:val="28"/>
+          <w:szCs w:val="28"/>
           <w:lang w:val="en-US"/>
         </w:rPr>
       </w:pPr>
@@ -357,6 +406,8 @@
           <w:rFonts w:ascii="Times New Roman" w:hAnsi="Times New Roman" w:cs="Times New Roman"/>
           <w:b/>
           <w:bCs/>
+          <w:sz w:val="28"/>
+          <w:szCs w:val="28"/>
           <w:lang w:val="en-US"/>
         </w:rPr>
         <w:t>Ứng dụng AI:</w:t>
@@ -364,66 +415,11 @@
       <w:r>
         <w:rPr>
           <w:rFonts w:ascii="Times New Roman" w:hAnsi="Times New Roman" w:cs="Times New Roman"/>
-          <w:lang w:val="en-US"/>
-        </w:rPr>
-        <w:t xml:space="preserve"> Nhóm đã sử dụng AI để:</w:t>
-      </w:r>
-    </w:p>
-    <w:p>
-      <w:pPr>
-        <w:numPr>
-          <w:ilvl w:val="1"/>
-          <w:numId w:val="3"/>
-        </w:numPr>
-        <w:rPr>
-          <w:rFonts w:ascii="Times New Roman" w:hAnsi="Times New Roman" w:cs="Times New Roman"/>
-          <w:lang w:val="en-US"/>
-        </w:rPr>
-      </w:pPr>
-      <w:r>
-        <w:rPr>
-          <w:rFonts w:ascii="Times New Roman" w:hAnsi="Times New Roman" w:cs="Times New Roman"/>
-          <w:lang w:val="en-US"/>
-        </w:rPr>
-        <w:t>Chuyển đổi nội dung văn bản từ SGK thành cấu trúc dữ liệu JSON/JS.</w:t>
-      </w:r>
-    </w:p>
-    <w:p>
-      <w:pPr>
-        <w:numPr>
-          <w:ilvl w:val="1"/>
-          <w:numId w:val="3"/>
-        </w:numPr>
-        <w:rPr>
-          <w:rFonts w:ascii="Times New Roman" w:hAnsi="Times New Roman" w:cs="Times New Roman"/>
-          <w:lang w:val="en-US"/>
-        </w:rPr>
-      </w:pPr>
-      <w:r>
-        <w:rPr>
-          <w:rFonts w:ascii="Times New Roman" w:hAnsi="Times New Roman" w:cs="Times New Roman"/>
-          <w:lang w:val="en-US"/>
-        </w:rPr>
-        <w:t>Sinh mã nguồn giao diện (CSS) với phong cách màu tối (Dark theme) chủ đạo Đỏ - Vàng.</w:t>
-      </w:r>
-    </w:p>
-    <w:p>
-      <w:pPr>
-        <w:numPr>
-          <w:ilvl w:val="1"/>
-          <w:numId w:val="3"/>
-        </w:numPr>
-        <w:rPr>
-          <w:rFonts w:ascii="Times New Roman" w:hAnsi="Times New Roman" w:cs="Times New Roman"/>
-          <w:lang w:val="en-US"/>
-        </w:rPr>
-      </w:pPr>
-      <w:r>
-        <w:rPr>
-          <w:rFonts w:ascii="Times New Roman" w:hAnsi="Times New Roman" w:cs="Times New Roman"/>
-          <w:lang w:val="en-US"/>
-        </w:rPr>
-        <w:t>Viết các hàm JavaScript để điều khiển bản đồ Leaflet: tự động zoom (flyTo), xóa/thêm marker, và vẽ hiệu ứng đường đi chuyển động.</w:t>
+          <w:sz w:val="28"/>
+          <w:szCs w:val="28"/>
+          <w:lang w:val="en-US"/>
+        </w:rPr>
+        <w:t xml:space="preserve"> Chúng em đã sử dụng AI để chuyển đổi nội dung từ SGK thành cấu trúc dữ liệu JSON/JS, sinh mã nguồn giao diện (Dark theme) và viết các hàm điều khiển bản đồ Leaflet (flyTo, marker, ant-path).</w:t>
       </w:r>
     </w:p>
     <w:p>
@@ -434,6 +430,8 @@
         </w:numPr>
         <w:rPr>
           <w:rFonts w:ascii="Times New Roman" w:hAnsi="Times New Roman" w:cs="Times New Roman"/>
+          <w:sz w:val="28"/>
+          <w:szCs w:val="28"/>
           <w:lang w:val="en-US"/>
         </w:rPr>
       </w:pPr>
@@ -442,22 +440,29 @@
           <w:rFonts w:ascii="Times New Roman" w:hAnsi="Times New Roman" w:cs="Times New Roman"/>
           <w:b/>
           <w:bCs/>
-          <w:lang w:val="en-US"/>
-        </w:rPr>
-        <w:t>Triển khai (Deploy):</w:t>
-      </w:r>
-      <w:r>
-        <w:rPr>
-          <w:rFonts w:ascii="Times New Roman" w:hAnsi="Times New Roman" w:cs="Times New Roman"/>
-          <w:lang w:val="en-US"/>
-        </w:rPr>
-        <w:t xml:space="preserve"> Sản phẩm được quản lý mã nguồn qua Git, đẩy lên GitHub và triển khai tự động (CI/CD) qua nền tảng Cloudflare Pages. Trang web chạy hoàn toàn offline (sau khi tải) hoặc trực tuyến với đường dẫn: phong-trao-tay-son.pages.dev.</w:t>
+          <w:sz w:val="28"/>
+          <w:szCs w:val="28"/>
+          <w:lang w:val="en-US"/>
+        </w:rPr>
+        <w:lastRenderedPageBreak/>
+        <w:t>Triển khai:</w:t>
+      </w:r>
+      <w:r>
+        <w:rPr>
+          <w:rFonts w:ascii="Times New Roman" w:hAnsi="Times New Roman" w:cs="Times New Roman"/>
+          <w:sz w:val="28"/>
+          <w:szCs w:val="28"/>
+          <w:lang w:val="en-US"/>
+        </w:rPr>
+        <w:t xml:space="preserve"> Quản lý mã nguồn qua Git, triển khai tự động qua nền tảng GitHub Pages.</w:t>
       </w:r>
     </w:p>
     <w:p>
       <w:pPr>
         <w:rPr>
           <w:rFonts w:ascii="Times New Roman" w:hAnsi="Times New Roman" w:cs="Times New Roman"/>
+          <w:sz w:val="28"/>
+          <w:szCs w:val="28"/>
           <w:lang w:val="en-US"/>
         </w:rPr>
       </w:pPr>
@@ -466,24 +471,23 @@
           <w:rFonts w:ascii="Times New Roman" w:hAnsi="Times New Roman" w:cs="Times New Roman"/>
           <w:b/>
           <w:bCs/>
-          <w:lang w:val="en-US"/>
-        </w:rPr>
-        <w:lastRenderedPageBreak/>
+          <w:sz w:val="28"/>
+          <w:szCs w:val="28"/>
+          <w:lang w:val="en-US"/>
+        </w:rPr>
         <w:t>IV. PHÂN CÔNG NHIỆM VỤ</w:t>
-      </w:r>
-      <w:r>
-        <w:rPr>
-          <w:rFonts w:ascii="Times New Roman" w:hAnsi="Times New Roman" w:cs="Times New Roman"/>
-          <w:lang w:val="en-US"/>
-        </w:rPr>
-        <w:br/>
-        <w:t>(Chép lại bảng phân công ở Phần 1)</w:t>
       </w:r>
     </w:p>
     <w:p>
       <w:pPr>
-        <w:rPr>
-          <w:rFonts w:ascii="Times New Roman" w:hAnsi="Times New Roman" w:cs="Times New Roman"/>
+        <w:numPr>
+          <w:ilvl w:val="0"/>
+          <w:numId w:val="4"/>
+        </w:numPr>
+        <w:rPr>
+          <w:rFonts w:ascii="Times New Roman" w:hAnsi="Times New Roman" w:cs="Times New Roman"/>
+          <w:sz w:val="28"/>
+          <w:szCs w:val="28"/>
           <w:lang w:val="en-US"/>
         </w:rPr>
       </w:pPr>
@@ -492,23 +496,230 @@
           <w:rFonts w:ascii="Times New Roman" w:hAnsi="Times New Roman" w:cs="Times New Roman"/>
           <w:b/>
           <w:bCs/>
-          <w:lang w:val="en-US"/>
-        </w:rPr>
-        <w:t>V. KẾT LUẬN</w:t>
-      </w:r>
-      <w:r>
-        <w:rPr>
-          <w:rFonts w:ascii="Times New Roman" w:hAnsi="Times New Roman" w:cs="Times New Roman"/>
-          <w:lang w:val="en-US"/>
-        </w:rPr>
-        <w:br/>
-        <w:t>Việc ứng dụng AI và bản đồ số không chỉ giúp nhóm 8 tiết kiệm thời gian thiết kế mà còn tạo ra một công cụ thuyết trình vượt trội. Bản đồ số giúp người xem dễ dàng hình dung không gian và thời gian của cuộc khởi nghĩa, biến những trang sử khô khan thành một trải nghiệm trực quan sinh động.</w:t>
+          <w:sz w:val="28"/>
+          <w:szCs w:val="28"/>
+          <w:lang w:val="en-US"/>
+        </w:rPr>
+        <w:t>Nguyễn Ngọc Phước (Nhóm trưởng):</w:t>
+      </w:r>
+      <w:r>
+        <w:rPr>
+          <w:rFonts w:ascii="Times New Roman" w:hAnsi="Times New Roman" w:cs="Times New Roman"/>
+          <w:sz w:val="28"/>
+          <w:szCs w:val="28"/>
+          <w:lang w:val="en-US"/>
+        </w:rPr>
+        <w:t xml:space="preserve"> Điều phối chung, phát triển web/bản đồ số bằng AI, thuyết trình mở đầu &amp; kết luận.</w:t>
       </w:r>
     </w:p>
     <w:p>
       <w:pPr>
-        <w:rPr>
-          <w:rFonts w:ascii="Times New Roman" w:hAnsi="Times New Roman" w:cs="Times New Roman"/>
+        <w:numPr>
+          <w:ilvl w:val="0"/>
+          <w:numId w:val="4"/>
+        </w:numPr>
+        <w:rPr>
+          <w:rFonts w:ascii="Times New Roman" w:hAnsi="Times New Roman" w:cs="Times New Roman"/>
+          <w:sz w:val="28"/>
+          <w:szCs w:val="28"/>
+          <w:lang w:val="en-US"/>
+        </w:rPr>
+      </w:pPr>
+      <w:r>
+        <w:rPr>
+          <w:rFonts w:ascii="Times New Roman" w:hAnsi="Times New Roman" w:cs="Times New Roman"/>
+          <w:b/>
+          <w:bCs/>
+          <w:sz w:val="28"/>
+          <w:szCs w:val="28"/>
+          <w:lang w:val="en-US"/>
+        </w:rPr>
+        <w:t>Hoàng Minh:</w:t>
+      </w:r>
+      <w:r>
+        <w:rPr>
+          <w:rFonts w:ascii="Times New Roman" w:hAnsi="Times New Roman" w:cs="Times New Roman"/>
+          <w:sz w:val="28"/>
+          <w:szCs w:val="28"/>
+          <w:lang w:val="en-US"/>
+        </w:rPr>
+        <w:t xml:space="preserve"> Nghiên cứu nội dung Bối cảnh lịch sử, tư liệu hình ảnh.</w:t>
+      </w:r>
+    </w:p>
+    <w:p>
+      <w:pPr>
+        <w:numPr>
+          <w:ilvl w:val="0"/>
+          <w:numId w:val="4"/>
+        </w:numPr>
+        <w:rPr>
+          <w:rFonts w:ascii="Times New Roman" w:hAnsi="Times New Roman" w:cs="Times New Roman"/>
+          <w:sz w:val="28"/>
+          <w:szCs w:val="28"/>
+          <w:lang w:val="en-US"/>
+        </w:rPr>
+      </w:pPr>
+      <w:r>
+        <w:rPr>
+          <w:rFonts w:ascii="Times New Roman" w:hAnsi="Times New Roman" w:cs="Times New Roman"/>
+          <w:b/>
+          <w:bCs/>
+          <w:sz w:val="28"/>
+          <w:szCs w:val="28"/>
+          <w:lang w:val="en-US"/>
+        </w:rPr>
+        <w:t>Trần Anh Minh:</w:t>
+      </w:r>
+      <w:r>
+        <w:rPr>
+          <w:rFonts w:ascii="Times New Roman" w:hAnsi="Times New Roman" w:cs="Times New Roman"/>
+          <w:sz w:val="28"/>
+          <w:szCs w:val="28"/>
+          <w:lang w:val="en-US"/>
+        </w:rPr>
+        <w:t xml:space="preserve"> Nghiên cứu Dòng thời gian, nhập liệu hệ thống mốc sự kiện.</w:t>
+      </w:r>
+    </w:p>
+    <w:p>
+      <w:pPr>
+        <w:numPr>
+          <w:ilvl w:val="0"/>
+          <w:numId w:val="4"/>
+        </w:numPr>
+        <w:rPr>
+          <w:rFonts w:ascii="Times New Roman" w:hAnsi="Times New Roman" w:cs="Times New Roman"/>
+          <w:sz w:val="28"/>
+          <w:szCs w:val="28"/>
+          <w:lang w:val="en-US"/>
+        </w:rPr>
+      </w:pPr>
+      <w:r>
+        <w:rPr>
+          <w:rFonts w:ascii="Times New Roman" w:hAnsi="Times New Roman" w:cs="Times New Roman"/>
+          <w:b/>
+          <w:bCs/>
+          <w:sz w:val="28"/>
+          <w:szCs w:val="28"/>
+          <w:lang w:val="en-US"/>
+        </w:rPr>
+        <w:t>Nguyễn Công Trí:</w:t>
+      </w:r>
+      <w:r>
+        <w:rPr>
+          <w:rFonts w:ascii="Times New Roman" w:hAnsi="Times New Roman" w:cs="Times New Roman"/>
+          <w:sz w:val="28"/>
+          <w:szCs w:val="28"/>
+          <w:lang w:val="en-US"/>
+        </w:rPr>
+        <w:t xml:space="preserve"> Nghiên cứu Diễn biến, kịch bản tương tác bản đồ, thuyết trình phần bản đồ.</w:t>
+      </w:r>
+    </w:p>
+    <w:p>
+      <w:pPr>
+        <w:numPr>
+          <w:ilvl w:val="0"/>
+          <w:numId w:val="4"/>
+        </w:numPr>
+        <w:rPr>
+          <w:rFonts w:ascii="Times New Roman" w:hAnsi="Times New Roman" w:cs="Times New Roman"/>
+          <w:sz w:val="28"/>
+          <w:szCs w:val="28"/>
+          <w:lang w:val="en-US"/>
+        </w:rPr>
+      </w:pPr>
+      <w:r>
+        <w:rPr>
+          <w:rFonts w:ascii="Times New Roman" w:hAnsi="Times New Roman" w:cs="Times New Roman"/>
+          <w:b/>
+          <w:bCs/>
+          <w:sz w:val="28"/>
+          <w:szCs w:val="28"/>
+          <w:lang w:val="en-US"/>
+        </w:rPr>
+        <w:t>Hoàng Minh Hùng:</w:t>
+      </w:r>
+      <w:r>
+        <w:rPr>
+          <w:rFonts w:ascii="Times New Roman" w:hAnsi="Times New Roman" w:cs="Times New Roman"/>
+          <w:sz w:val="28"/>
+          <w:szCs w:val="28"/>
+          <w:lang w:val="en-US"/>
+        </w:rPr>
+        <w:t xml:space="preserve"> Nghiên cứu Kết quả, kiểm thử giao diện (QA/QC), rà soát lỗi.</w:t>
+      </w:r>
+    </w:p>
+    <w:p>
+      <w:pPr>
+        <w:numPr>
+          <w:ilvl w:val="0"/>
+          <w:numId w:val="4"/>
+        </w:numPr>
+        <w:rPr>
+          <w:rFonts w:ascii="Times New Roman" w:hAnsi="Times New Roman" w:cs="Times New Roman"/>
+          <w:sz w:val="28"/>
+          <w:szCs w:val="28"/>
+          <w:lang w:val="en-US"/>
+        </w:rPr>
+      </w:pPr>
+      <w:r>
+        <w:rPr>
+          <w:rFonts w:ascii="Times New Roman" w:hAnsi="Times New Roman" w:cs="Times New Roman"/>
+          <w:b/>
+          <w:bCs/>
+          <w:sz w:val="28"/>
+          <w:szCs w:val="28"/>
+          <w:lang w:val="en-US"/>
+        </w:rPr>
+        <w:t>Nguyễn Hoàng Gia Bảo:</w:t>
+      </w:r>
+      <w:r>
+        <w:rPr>
+          <w:rFonts w:ascii="Times New Roman" w:hAnsi="Times New Roman" w:cs="Times New Roman"/>
+          <w:sz w:val="28"/>
+          <w:szCs w:val="28"/>
+          <w:lang w:val="en-US"/>
+        </w:rPr>
+        <w:t xml:space="preserve"> Nghiên cứu Ý nghĩa lịch sử, soạn thảo báo cáo Word/PDF.</w:t>
+      </w:r>
+    </w:p>
+    <w:p>
+      <w:pPr>
+        <w:rPr>
+          <w:rFonts w:ascii="Times New Roman" w:hAnsi="Times New Roman" w:cs="Times New Roman"/>
+          <w:sz w:val="28"/>
+          <w:szCs w:val="28"/>
+          <w:lang w:val="en-US"/>
+        </w:rPr>
+      </w:pPr>
+      <w:r>
+        <w:rPr>
+          <w:rFonts w:ascii="Times New Roman" w:hAnsi="Times New Roman" w:cs="Times New Roman"/>
+          <w:b/>
+          <w:bCs/>
+          <w:sz w:val="28"/>
+          <w:szCs w:val="28"/>
+          <w:lang w:val="en-US"/>
+        </w:rPr>
+        <w:t>V. KẾT LUẬN</w:t>
+      </w:r>
+      <w:r>
+        <w:rPr>
+          <w:rFonts w:ascii="Times New Roman" w:hAnsi="Times New Roman" w:cs="Times New Roman"/>
+          <w:sz w:val="28"/>
+          <w:szCs w:val="28"/>
+          <w:lang w:val="en-US"/>
+        </w:rPr>
+        <w:br/>
+        <w:t>Việc ứng dụng AI và bản đồ số đã giúp chúng em tạo ra một công cụ thuyết trình vượt trội, biến những trang sử khô khan thành một trải nghiệm trực quan. Bản đồ số giúp người xem dễ dàng hình dung không gian và thời gian của cuộc khởi nghĩa.</w:t>
+      </w:r>
+    </w:p>
+    <w:p>
+      <w:pPr>
+        <w:rPr>
+          <w:rFonts w:ascii="Times New Roman" w:hAnsi="Times New Roman" w:cs="Times New Roman"/>
+          <w:sz w:val="28"/>
+          <w:szCs w:val="28"/>
+          <w:lang w:val="en-US"/>
         </w:rPr>
       </w:pPr>
     </w:p>
@@ -525,9 +736,9 @@
 <file path=word/numbering.xml><?xml version="1.0" encoding="utf-8"?>
 <w:numbering xmlns:wpc="http://schemas.microsoft.com/office/word/2010/wordprocessingCanvas" xmlns:cx="http://schemas.microsoft.com/office/drawing/2014/chartex" xmlns:cx1="http://schemas.microsoft.com/office/drawing/2015/9/8/chartex" xmlns:cx2="http://schemas.microsoft.com/office/drawing/2015/10/21/chartex" xmlns:cx3="http://schemas.microsoft.com/office/drawing/2016/5/9/chartex" xmlns:cx4="http://schemas.microsoft.com/office/drawing/2016/5/10/chartex" xmlns:cx5="http://schemas.microsoft.com/office/drawing/2016/5/11/chartex" xmlns:cx6="http://schemas.microsoft.com/office/drawing/2016/5/12/chartex" xmlns:cx7="http://schemas.microsoft.com/office/drawing/2016/5/13/chartex" xmlns:cx8="http://schemas.microsoft.com/office/drawing/2016/5/14/chartex" xmlns:mc="http://schemas.openxmlformats.org/markup-compatibility/2006" xmlns:aink="http://schemas.microsoft.com/office/drawing/2016/ink" xmlns:am3d="http://schemas.microsoft.com/office/drawing/2017/model3d" xmlns:o="urn:schemas-microsoft-com:office:office" xmlns:oel="http://schemas.microsoft.com/office/2019/extlst" xmlns:r="http://schemas.openxmlformats.org/officeDocument/2006/relationships" xmlns:m="http://schemas.openxmlformats.org/officeDocument/2006/math" xmlns:v="urn:schemas-microsoft-com:vml" xmlns:wp14="http://schemas.microsoft.com/office/word/2010/wordprocessingDrawing" xmlns:wp="http://schemas.openxmlformats.org/drawingml/2006/wordprocessingDrawing" xmlns:w10="urn:schemas-microsoft-com:office:word" xmlns:w="http://schemas.openxmlformats.org/wordprocessingml/2006/main" xmlns:w14="http://schemas.microsoft.com/office/word/2010/wordml" xmlns:w15="http://schemas.microsoft.com/office/word/2012/wordml" xmlns:w16cex="http://schemas.microsoft.com/office/word/2018/wordml/cex" xmlns:w16cid="http://schemas.microsoft.com/office/word/2016/wordml/cid" xmlns:w16="http://schemas.microsoft.com/office/word/2018/wordml" xmlns:w16du="http://schemas.microsoft.com/office/word/2023/wordml/word16du" xmlns:w16sdtdh="http://schemas.microsoft.com/office/word/2020/wordml/sdtdatahash" xmlns:w16sdtfl="http://schemas.microsoft.com/office/word/2024/wordml/sdtformatlock" xmlns:w16se="http://schemas.microsoft.com/office/word/2015/wordml/symex" xmlns:wpg="http://schemas.microsoft.com/office/word/2010/wordprocessingGroup" xmlns:wpi="http://schemas.microsoft.com/office/word/2010/wordprocessingInk" xmlns:wne="http://schemas.microsoft.com/office/word/2006/wordml" xmlns:wps="http://schemas.microsoft.com/office/word/2010/wordprocessingShape" mc:Ignorable="w14 w15 w16se w16cid w16 w16cex w16sdtdh w16sdtfl w16du wp14">
   <w:abstractNum w:abstractNumId="0" w15:restartNumberingAfterBreak="0">
-    <w:nsid w:val="579378D3"/>
+    <w:nsid w:val="179A2407"/>
     <w:multiLevelType w:val="multilevel"/>
-    <w:tmpl w:val="14D0B1DA"/>
+    <w:tmpl w:val="A3D827AA"/>
     <w:lvl w:ilvl="0">
       <w:start w:val="1"/>
       <w:numFmt w:val="decimal"/>
@@ -638,13 +849,13 @@
     </w:lvl>
   </w:abstractNum>
   <w:abstractNum w:abstractNumId="1" w15:restartNumberingAfterBreak="0">
-    <w:nsid w:val="5F643D8F"/>
+    <w:nsid w:val="324714F7"/>
     <w:multiLevelType w:val="multilevel"/>
-    <w:tmpl w:val="C2AAA9EE"/>
+    <w:tmpl w:val="1BA636A8"/>
     <w:lvl w:ilvl="0">
       <w:start w:val="1"/>
-      <w:numFmt w:val="decimal"/>
-      <w:lvlText w:val="%1."/>
+      <w:numFmt w:val="bullet"/>
+      <w:lvlText w:val=""/>
       <w:lvlJc w:val="left"/>
       <w:pPr>
         <w:tabs>
@@ -652,121 +863,12 @@
         </w:tabs>
         <w:ind w:left="720" w:hanging="360"/>
       </w:pPr>
+      <w:rPr>
+        <w:rFonts w:ascii="Symbol" w:hAnsi="Symbol" w:hint="default"/>
+        <w:sz w:val="20"/>
+      </w:rPr>
     </w:lvl>
     <w:lvl w:ilvl="1" w:tentative="1">
-      <w:start w:val="1"/>
-      <w:numFmt w:val="decimal"/>
-      <w:lvlText w:val="%2."/>
-      <w:lvlJc w:val="left"/>
-      <w:pPr>
-        <w:tabs>
-          <w:tab w:val="num" w:pos="1440"/>
-        </w:tabs>
-        <w:ind w:left="1440" w:hanging="360"/>
-      </w:pPr>
-    </w:lvl>
-    <w:lvl w:ilvl="2" w:tentative="1">
-      <w:start w:val="1"/>
-      <w:numFmt w:val="decimal"/>
-      <w:lvlText w:val="%3."/>
-      <w:lvlJc w:val="left"/>
-      <w:pPr>
-        <w:tabs>
-          <w:tab w:val="num" w:pos="2160"/>
-        </w:tabs>
-        <w:ind w:left="2160" w:hanging="360"/>
-      </w:pPr>
-    </w:lvl>
-    <w:lvl w:ilvl="3" w:tentative="1">
-      <w:start w:val="1"/>
-      <w:numFmt w:val="decimal"/>
-      <w:lvlText w:val="%4."/>
-      <w:lvlJc w:val="left"/>
-      <w:pPr>
-        <w:tabs>
-          <w:tab w:val="num" w:pos="2880"/>
-        </w:tabs>
-        <w:ind w:left="2880" w:hanging="360"/>
-      </w:pPr>
-    </w:lvl>
-    <w:lvl w:ilvl="4" w:tentative="1">
-      <w:start w:val="1"/>
-      <w:numFmt w:val="decimal"/>
-      <w:lvlText w:val="%5."/>
-      <w:lvlJc w:val="left"/>
-      <w:pPr>
-        <w:tabs>
-          <w:tab w:val="num" w:pos="3600"/>
-        </w:tabs>
-        <w:ind w:left="3600" w:hanging="360"/>
-      </w:pPr>
-    </w:lvl>
-    <w:lvl w:ilvl="5" w:tentative="1">
-      <w:start w:val="1"/>
-      <w:numFmt w:val="decimal"/>
-      <w:lvlText w:val="%6."/>
-      <w:lvlJc w:val="left"/>
-      <w:pPr>
-        <w:tabs>
-          <w:tab w:val="num" w:pos="4320"/>
-        </w:tabs>
-        <w:ind w:left="4320" w:hanging="360"/>
-      </w:pPr>
-    </w:lvl>
-    <w:lvl w:ilvl="6" w:tentative="1">
-      <w:start w:val="1"/>
-      <w:numFmt w:val="decimal"/>
-      <w:lvlText w:val="%7."/>
-      <w:lvlJc w:val="left"/>
-      <w:pPr>
-        <w:tabs>
-          <w:tab w:val="num" w:pos="5040"/>
-        </w:tabs>
-        <w:ind w:left="5040" w:hanging="360"/>
-      </w:pPr>
-    </w:lvl>
-    <w:lvl w:ilvl="7" w:tentative="1">
-      <w:start w:val="1"/>
-      <w:numFmt w:val="decimal"/>
-      <w:lvlText w:val="%8."/>
-      <w:lvlJc w:val="left"/>
-      <w:pPr>
-        <w:tabs>
-          <w:tab w:val="num" w:pos="5760"/>
-        </w:tabs>
-        <w:ind w:left="5760" w:hanging="360"/>
-      </w:pPr>
-    </w:lvl>
-    <w:lvl w:ilvl="8" w:tentative="1">
-      <w:start w:val="1"/>
-      <w:numFmt w:val="decimal"/>
-      <w:lvlText w:val="%9."/>
-      <w:lvlJc w:val="left"/>
-      <w:pPr>
-        <w:tabs>
-          <w:tab w:val="num" w:pos="6480"/>
-        </w:tabs>
-        <w:ind w:left="6480" w:hanging="360"/>
-      </w:pPr>
-    </w:lvl>
-  </w:abstractNum>
-  <w:abstractNum w:abstractNumId="2" w15:restartNumberingAfterBreak="0">
-    <w:nsid w:val="7022215C"/>
-    <w:multiLevelType w:val="multilevel"/>
-    <w:tmpl w:val="009E2D76"/>
-    <w:lvl w:ilvl="0">
-      <w:start w:val="1"/>
-      <w:numFmt w:val="decimal"/>
-      <w:lvlText w:val="%1."/>
-      <w:lvlJc w:val="left"/>
-      <w:pPr>
-        <w:tabs>
-          <w:tab w:val="num" w:pos="720"/>
-        </w:tabs>
-        <w:ind w:left="720" w:hanging="360"/>
-      </w:pPr>
-    </w:lvl>
-    <w:lvl w:ilvl="1">
       <w:start w:val="1"/>
       <w:numFmt w:val="bullet"/>
       <w:lvlText w:val="o"/>
@@ -784,6 +886,147 @@
     </w:lvl>
     <w:lvl w:ilvl="2" w:tentative="1">
       <w:start w:val="1"/>
+      <w:numFmt w:val="bullet"/>
+      <w:lvlText w:val=""/>
+      <w:lvlJc w:val="left"/>
+      <w:pPr>
+        <w:tabs>
+          <w:tab w:val="num" w:pos="2160"/>
+        </w:tabs>
+        <w:ind w:left="2160" w:hanging="360"/>
+      </w:pPr>
+      <w:rPr>
+        <w:rFonts w:ascii="Wingdings" w:hAnsi="Wingdings" w:hint="default"/>
+        <w:sz w:val="20"/>
+      </w:rPr>
+    </w:lvl>
+    <w:lvl w:ilvl="3" w:tentative="1">
+      <w:start w:val="1"/>
+      <w:numFmt w:val="bullet"/>
+      <w:lvlText w:val=""/>
+      <w:lvlJc w:val="left"/>
+      <w:pPr>
+        <w:tabs>
+          <w:tab w:val="num" w:pos="2880"/>
+        </w:tabs>
+        <w:ind w:left="2880" w:hanging="360"/>
+      </w:pPr>
+      <w:rPr>
+        <w:rFonts w:ascii="Wingdings" w:hAnsi="Wingdings" w:hint="default"/>
+        <w:sz w:val="20"/>
+      </w:rPr>
+    </w:lvl>
+    <w:lvl w:ilvl="4" w:tentative="1">
+      <w:start w:val="1"/>
+      <w:numFmt w:val="bullet"/>
+      <w:lvlText w:val=""/>
+      <w:lvlJc w:val="left"/>
+      <w:pPr>
+        <w:tabs>
+          <w:tab w:val="num" w:pos="3600"/>
+        </w:tabs>
+        <w:ind w:left="3600" w:hanging="360"/>
+      </w:pPr>
+      <w:rPr>
+        <w:rFonts w:ascii="Wingdings" w:hAnsi="Wingdings" w:hint="default"/>
+        <w:sz w:val="20"/>
+      </w:rPr>
+    </w:lvl>
+    <w:lvl w:ilvl="5" w:tentative="1">
+      <w:start w:val="1"/>
+      <w:numFmt w:val="bullet"/>
+      <w:lvlText w:val=""/>
+      <w:lvlJc w:val="left"/>
+      <w:pPr>
+        <w:tabs>
+          <w:tab w:val="num" w:pos="4320"/>
+        </w:tabs>
+        <w:ind w:left="4320" w:hanging="360"/>
+      </w:pPr>
+      <w:rPr>
+        <w:rFonts w:ascii="Wingdings" w:hAnsi="Wingdings" w:hint="default"/>
+        <w:sz w:val="20"/>
+      </w:rPr>
+    </w:lvl>
+    <w:lvl w:ilvl="6" w:tentative="1">
+      <w:start w:val="1"/>
+      <w:numFmt w:val="bullet"/>
+      <w:lvlText w:val=""/>
+      <w:lvlJc w:val="left"/>
+      <w:pPr>
+        <w:tabs>
+          <w:tab w:val="num" w:pos="5040"/>
+        </w:tabs>
+        <w:ind w:left="5040" w:hanging="360"/>
+      </w:pPr>
+      <w:rPr>
+        <w:rFonts w:ascii="Wingdings" w:hAnsi="Wingdings" w:hint="default"/>
+        <w:sz w:val="20"/>
+      </w:rPr>
+    </w:lvl>
+    <w:lvl w:ilvl="7" w:tentative="1">
+      <w:start w:val="1"/>
+      <w:numFmt w:val="bullet"/>
+      <w:lvlText w:val=""/>
+      <w:lvlJc w:val="left"/>
+      <w:pPr>
+        <w:tabs>
+          <w:tab w:val="num" w:pos="5760"/>
+        </w:tabs>
+        <w:ind w:left="5760" w:hanging="360"/>
+      </w:pPr>
+      <w:rPr>
+        <w:rFonts w:ascii="Wingdings" w:hAnsi="Wingdings" w:hint="default"/>
+        <w:sz w:val="20"/>
+      </w:rPr>
+    </w:lvl>
+    <w:lvl w:ilvl="8" w:tentative="1">
+      <w:start w:val="1"/>
+      <w:numFmt w:val="bullet"/>
+      <w:lvlText w:val=""/>
+      <w:lvlJc w:val="left"/>
+      <w:pPr>
+        <w:tabs>
+          <w:tab w:val="num" w:pos="6480"/>
+        </w:tabs>
+        <w:ind w:left="6480" w:hanging="360"/>
+      </w:pPr>
+      <w:rPr>
+        <w:rFonts w:ascii="Wingdings" w:hAnsi="Wingdings" w:hint="default"/>
+        <w:sz w:val="20"/>
+      </w:rPr>
+    </w:lvl>
+  </w:abstractNum>
+  <w:abstractNum w:abstractNumId="2" w15:restartNumberingAfterBreak="0">
+    <w:nsid w:val="53FA71D7"/>
+    <w:multiLevelType w:val="multilevel"/>
+    <w:tmpl w:val="4D400B86"/>
+    <w:lvl w:ilvl="0">
+      <w:start w:val="1"/>
+      <w:numFmt w:val="decimal"/>
+      <w:lvlText w:val="%1."/>
+      <w:lvlJc w:val="left"/>
+      <w:pPr>
+        <w:tabs>
+          <w:tab w:val="num" w:pos="720"/>
+        </w:tabs>
+        <w:ind w:left="720" w:hanging="360"/>
+      </w:pPr>
+    </w:lvl>
+    <w:lvl w:ilvl="1" w:tentative="1">
+      <w:start w:val="1"/>
+      <w:numFmt w:val="decimal"/>
+      <w:lvlText w:val="%2."/>
+      <w:lvlJc w:val="left"/>
+      <w:pPr>
+        <w:tabs>
+          <w:tab w:val="num" w:pos="1440"/>
+        </w:tabs>
+        <w:ind w:left="1440" w:hanging="360"/>
+      </w:pPr>
+    </w:lvl>
+    <w:lvl w:ilvl="2" w:tentative="1">
+      <w:start w:val="1"/>
       <w:numFmt w:val="decimal"/>
       <w:lvlText w:val="%3."/>
       <w:lvlJc w:val="left"/>
@@ -867,14 +1110,130 @@
       </w:pPr>
     </w:lvl>
   </w:abstractNum>
-  <w:num w:numId="1" w16cid:durableId="978025642">
+  <w:abstractNum w:abstractNumId="3" w15:restartNumberingAfterBreak="0">
+    <w:nsid w:val="5A3C67E8"/>
+    <w:multiLevelType w:val="multilevel"/>
+    <w:tmpl w:val="DE32A93E"/>
+    <w:lvl w:ilvl="0">
+      <w:start w:val="1"/>
+      <w:numFmt w:val="decimal"/>
+      <w:lvlText w:val="%1."/>
+      <w:lvlJc w:val="left"/>
+      <w:pPr>
+        <w:tabs>
+          <w:tab w:val="num" w:pos="720"/>
+        </w:tabs>
+        <w:ind w:left="720" w:hanging="360"/>
+      </w:pPr>
+    </w:lvl>
+    <w:lvl w:ilvl="1" w:tentative="1">
+      <w:start w:val="1"/>
+      <w:numFmt w:val="decimal"/>
+      <w:lvlText w:val="%2."/>
+      <w:lvlJc w:val="left"/>
+      <w:pPr>
+        <w:tabs>
+          <w:tab w:val="num" w:pos="1440"/>
+        </w:tabs>
+        <w:ind w:left="1440" w:hanging="360"/>
+      </w:pPr>
+    </w:lvl>
+    <w:lvl w:ilvl="2" w:tentative="1">
+      <w:start w:val="1"/>
+      <w:numFmt w:val="decimal"/>
+      <w:lvlText w:val="%3."/>
+      <w:lvlJc w:val="left"/>
+      <w:pPr>
+        <w:tabs>
+          <w:tab w:val="num" w:pos="2160"/>
+        </w:tabs>
+        <w:ind w:left="2160" w:hanging="360"/>
+      </w:pPr>
+    </w:lvl>
+    <w:lvl w:ilvl="3" w:tentative="1">
+      <w:start w:val="1"/>
+      <w:numFmt w:val="decimal"/>
+      <w:lvlText w:val="%4."/>
+      <w:lvlJc w:val="left"/>
+      <w:pPr>
+        <w:tabs>
+          <w:tab w:val="num" w:pos="2880"/>
+        </w:tabs>
+        <w:ind w:left="2880" w:hanging="360"/>
+      </w:pPr>
+    </w:lvl>
+    <w:lvl w:ilvl="4" w:tentative="1">
+      <w:start w:val="1"/>
+      <w:numFmt w:val="decimal"/>
+      <w:lvlText w:val="%5."/>
+      <w:lvlJc w:val="left"/>
+      <w:pPr>
+        <w:tabs>
+          <w:tab w:val="num" w:pos="3600"/>
+        </w:tabs>
+        <w:ind w:left="3600" w:hanging="360"/>
+      </w:pPr>
+    </w:lvl>
+    <w:lvl w:ilvl="5" w:tentative="1">
+      <w:start w:val="1"/>
+      <w:numFmt w:val="decimal"/>
+      <w:lvlText w:val="%6."/>
+      <w:lvlJc w:val="left"/>
+      <w:pPr>
+        <w:tabs>
+          <w:tab w:val="num" w:pos="4320"/>
+        </w:tabs>
+        <w:ind w:left="4320" w:hanging="360"/>
+      </w:pPr>
+    </w:lvl>
+    <w:lvl w:ilvl="6" w:tentative="1">
+      <w:start w:val="1"/>
+      <w:numFmt w:val="decimal"/>
+      <w:lvlText w:val="%7."/>
+      <w:lvlJc w:val="left"/>
+      <w:pPr>
+        <w:tabs>
+          <w:tab w:val="num" w:pos="5040"/>
+        </w:tabs>
+        <w:ind w:left="5040" w:hanging="360"/>
+      </w:pPr>
+    </w:lvl>
+    <w:lvl w:ilvl="7" w:tentative="1">
+      <w:start w:val="1"/>
+      <w:numFmt w:val="decimal"/>
+      <w:lvlText w:val="%8."/>
+      <w:lvlJc w:val="left"/>
+      <w:pPr>
+        <w:tabs>
+          <w:tab w:val="num" w:pos="5760"/>
+        </w:tabs>
+        <w:ind w:left="5760" w:hanging="360"/>
+      </w:pPr>
+    </w:lvl>
+    <w:lvl w:ilvl="8" w:tentative="1">
+      <w:start w:val="1"/>
+      <w:numFmt w:val="decimal"/>
+      <w:lvlText w:val="%9."/>
+      <w:lvlJc w:val="left"/>
+      <w:pPr>
+        <w:tabs>
+          <w:tab w:val="num" w:pos="6480"/>
+        </w:tabs>
+        <w:ind w:left="6480" w:hanging="360"/>
+      </w:pPr>
+    </w:lvl>
+  </w:abstractNum>
+  <w:num w:numId="1" w16cid:durableId="11491335">
     <w:abstractNumId w:val="0"/>
   </w:num>
-  <w:num w:numId="2" w16cid:durableId="1208759208">
+  <w:num w:numId="2" w16cid:durableId="514466616">
+    <w:abstractNumId w:val="3"/>
+  </w:num>
+  <w:num w:numId="3" w16cid:durableId="1006052675">
+    <w:abstractNumId w:val="2"/>
+  </w:num>
+  <w:num w:numId="4" w16cid:durableId="760949287">
     <w:abstractNumId w:val="1"/>
-  </w:num>
-  <w:num w:numId="3" w16cid:durableId="643394517">
-    <w:abstractNumId w:val="2"/>
   </w:num>
 </w:numbering>
 </file>
@@ -1291,7 +1650,7 @@
     <w:link w:val="u1Char"/>
     <w:uiPriority w:val="9"/>
     <w:qFormat/>
-    <w:rsid w:val="00CB13C5"/>
+    <w:rsid w:val="00D31D73"/>
     <w:pPr>
       <w:keepNext/>
       <w:keepLines/>
@@ -1314,7 +1673,7 @@
     <w:semiHidden/>
     <w:unhideWhenUsed/>
     <w:qFormat/>
-    <w:rsid w:val="00CB13C5"/>
+    <w:rsid w:val="00D31D73"/>
     <w:pPr>
       <w:keepNext/>
       <w:keepLines/>
@@ -1337,7 +1696,7 @@
     <w:semiHidden/>
     <w:unhideWhenUsed/>
     <w:qFormat/>
-    <w:rsid w:val="00CB13C5"/>
+    <w:rsid w:val="00D31D73"/>
     <w:pPr>
       <w:keepNext/>
       <w:keepLines/>
@@ -1360,7 +1719,7 @@
     <w:semiHidden/>
     <w:unhideWhenUsed/>
     <w:qFormat/>
-    <w:rsid w:val="00CB13C5"/>
+    <w:rsid w:val="00D31D73"/>
     <w:pPr>
       <w:keepNext/>
       <w:keepLines/>
@@ -1383,7 +1742,7 @@
     <w:semiHidden/>
     <w:unhideWhenUsed/>
     <w:qFormat/>
-    <w:rsid w:val="00CB13C5"/>
+    <w:rsid w:val="00D31D73"/>
     <w:pPr>
       <w:keepNext/>
       <w:keepLines/>
@@ -1404,7 +1763,7 @@
     <w:semiHidden/>
     <w:unhideWhenUsed/>
     <w:qFormat/>
-    <w:rsid w:val="00CB13C5"/>
+    <w:rsid w:val="00D31D73"/>
     <w:pPr>
       <w:keepNext/>
       <w:keepLines/>
@@ -1427,7 +1786,7 @@
     <w:semiHidden/>
     <w:unhideWhenUsed/>
     <w:qFormat/>
-    <w:rsid w:val="00CB13C5"/>
+    <w:rsid w:val="00D31D73"/>
     <w:pPr>
       <w:keepNext/>
       <w:keepLines/>
@@ -1448,7 +1807,7 @@
     <w:semiHidden/>
     <w:unhideWhenUsed/>
     <w:qFormat/>
-    <w:rsid w:val="00CB13C5"/>
+    <w:rsid w:val="00D31D73"/>
     <w:pPr>
       <w:keepNext/>
       <w:keepLines/>
@@ -1471,7 +1830,7 @@
     <w:semiHidden/>
     <w:unhideWhenUsed/>
     <w:qFormat/>
-    <w:rsid w:val="00CB13C5"/>
+    <w:rsid w:val="00D31D73"/>
     <w:pPr>
       <w:keepNext/>
       <w:keepLines/>
@@ -1514,7 +1873,7 @@
     <w:basedOn w:val="Phngmcinhcuaoanvn"/>
     <w:link w:val="u1"/>
     <w:uiPriority w:val="9"/>
-    <w:rsid w:val="00CB13C5"/>
+    <w:rsid w:val="00D31D73"/>
     <w:rPr>
       <w:rFonts w:asciiTheme="majorHAnsi" w:eastAsiaTheme="majorEastAsia" w:hAnsiTheme="majorHAnsi" w:cstheme="majorBidi"/>
       <w:noProof/>
@@ -1530,7 +1889,7 @@
     <w:link w:val="u2"/>
     <w:uiPriority w:val="9"/>
     <w:semiHidden/>
-    <w:rsid w:val="00CB13C5"/>
+    <w:rsid w:val="00D31D73"/>
     <w:rPr>
       <w:rFonts w:asciiTheme="majorHAnsi" w:eastAsiaTheme="majorEastAsia" w:hAnsiTheme="majorHAnsi" w:cstheme="majorBidi"/>
       <w:noProof/>
@@ -1546,7 +1905,7 @@
     <w:link w:val="u3"/>
     <w:uiPriority w:val="9"/>
     <w:semiHidden/>
-    <w:rsid w:val="00CB13C5"/>
+    <w:rsid w:val="00D31D73"/>
     <w:rPr>
       <w:rFonts w:eastAsiaTheme="majorEastAsia" w:cstheme="majorBidi"/>
       <w:noProof/>
@@ -1562,7 +1921,7 @@
     <w:link w:val="u4"/>
     <w:uiPriority w:val="9"/>
     <w:semiHidden/>
-    <w:rsid w:val="00CB13C5"/>
+    <w:rsid w:val="00D31D73"/>
     <w:rPr>
       <w:rFonts w:eastAsiaTheme="majorEastAsia" w:cstheme="majorBidi"/>
       <w:i/>
@@ -1578,7 +1937,7 @@
     <w:link w:val="u5"/>
     <w:uiPriority w:val="9"/>
     <w:semiHidden/>
-    <w:rsid w:val="00CB13C5"/>
+    <w:rsid w:val="00D31D73"/>
     <w:rPr>
       <w:rFonts w:eastAsiaTheme="majorEastAsia" w:cstheme="majorBidi"/>
       <w:noProof/>
@@ -1592,7 +1951,7 @@
     <w:link w:val="u6"/>
     <w:uiPriority w:val="9"/>
     <w:semiHidden/>
-    <w:rsid w:val="00CB13C5"/>
+    <w:rsid w:val="00D31D73"/>
     <w:rPr>
       <w:rFonts w:eastAsiaTheme="majorEastAsia" w:cstheme="majorBidi"/>
       <w:i/>
@@ -1608,7 +1967,7 @@
     <w:link w:val="u7"/>
     <w:uiPriority w:val="9"/>
     <w:semiHidden/>
-    <w:rsid w:val="00CB13C5"/>
+    <w:rsid w:val="00D31D73"/>
     <w:rPr>
       <w:rFonts w:eastAsiaTheme="majorEastAsia" w:cstheme="majorBidi"/>
       <w:noProof/>
@@ -1622,7 +1981,7 @@
     <w:link w:val="u8"/>
     <w:uiPriority w:val="9"/>
     <w:semiHidden/>
-    <w:rsid w:val="00CB13C5"/>
+    <w:rsid w:val="00D31D73"/>
     <w:rPr>
       <w:rFonts w:eastAsiaTheme="majorEastAsia" w:cstheme="majorBidi"/>
       <w:i/>
@@ -1638,7 +1997,7 @@
     <w:link w:val="u9"/>
     <w:uiPriority w:val="9"/>
     <w:semiHidden/>
-    <w:rsid w:val="00CB13C5"/>
+    <w:rsid w:val="00D31D73"/>
     <w:rPr>
       <w:rFonts w:eastAsiaTheme="majorEastAsia" w:cstheme="majorBidi"/>
       <w:noProof/>
@@ -1653,7 +2012,7 @@
     <w:link w:val="TiuChar"/>
     <w:uiPriority w:val="10"/>
     <w:qFormat/>
-    <w:rsid w:val="00CB13C5"/>
+    <w:rsid w:val="00D31D73"/>
     <w:pPr>
       <w:spacing w:after="80" w:line="240" w:lineRule="auto"/>
       <w:contextualSpacing/>
@@ -1671,7 +2030,7 @@
     <w:basedOn w:val="Phngmcinhcuaoanvn"/>
     <w:link w:val="Tiu"/>
     <w:uiPriority w:val="10"/>
-    <w:rsid w:val="00CB13C5"/>
+    <w:rsid w:val="00D31D73"/>
     <w:rPr>
       <w:rFonts w:asciiTheme="majorHAnsi" w:eastAsiaTheme="majorEastAsia" w:hAnsiTheme="majorHAnsi" w:cstheme="majorBidi"/>
       <w:noProof/>
@@ -1689,7 +2048,7 @@
     <w:link w:val="TiuphuChar"/>
     <w:uiPriority w:val="11"/>
     <w:qFormat/>
-    <w:rsid w:val="00CB13C5"/>
+    <w:rsid w:val="00D31D73"/>
     <w:pPr>
       <w:numPr>
         <w:ilvl w:val="1"/>
@@ -1708,7 +2067,7 @@
     <w:basedOn w:val="Phngmcinhcuaoanvn"/>
     <w:link w:val="Tiuphu"/>
     <w:uiPriority w:val="11"/>
-    <w:rsid w:val="00CB13C5"/>
+    <w:rsid w:val="00D31D73"/>
     <w:rPr>
       <w:rFonts w:eastAsiaTheme="majorEastAsia" w:cstheme="majorBidi"/>
       <w:noProof/>
@@ -1726,7 +2085,7 @@
     <w:link w:val="LitrichdnChar"/>
     <w:uiPriority w:val="29"/>
     <w:qFormat/>
-    <w:rsid w:val="00CB13C5"/>
+    <w:rsid w:val="00D31D73"/>
     <w:pPr>
       <w:spacing w:before="160"/>
       <w:jc w:val="center"/>
@@ -1742,7 +2101,7 @@
     <w:basedOn w:val="Phngmcinhcuaoanvn"/>
     <w:link w:val="Litrichdn"/>
     <w:uiPriority w:val="29"/>
-    <w:rsid w:val="00CB13C5"/>
+    <w:rsid w:val="00D31D73"/>
     <w:rPr>
       <w:i/>
       <w:iCs/>
@@ -1756,7 +2115,7 @@
     <w:basedOn w:val="Binhthng"/>
     <w:uiPriority w:val="34"/>
     <w:qFormat/>
-    <w:rsid w:val="00CB13C5"/>
+    <w:rsid w:val="00D31D73"/>
     <w:pPr>
       <w:ind w:left="720"/>
       <w:contextualSpacing/>
@@ -1767,7 +2126,7 @@
     <w:basedOn w:val="Phngmcinhcuaoanvn"/>
     <w:uiPriority w:val="21"/>
     <w:qFormat/>
-    <w:rsid w:val="00CB13C5"/>
+    <w:rsid w:val="00D31D73"/>
     <w:rPr>
       <w:i/>
       <w:iCs/>
@@ -1781,7 +2140,7 @@
     <w:link w:val="NhaykepmChar"/>
     <w:uiPriority w:val="30"/>
     <w:qFormat/>
-    <w:rsid w:val="00CB13C5"/>
+    <w:rsid w:val="00D31D73"/>
     <w:pPr>
       <w:pBdr>
         <w:top w:val="single" w:sz="4" w:space="10" w:color="0F4761" w:themeColor="accent1" w:themeShade="BF"/>
@@ -1802,7 +2161,7 @@
     <w:basedOn w:val="Phngmcinhcuaoanvn"/>
     <w:link w:val="Nhaykepm"/>
     <w:uiPriority w:val="30"/>
-    <w:rsid w:val="00CB13C5"/>
+    <w:rsid w:val="00D31D73"/>
     <w:rPr>
       <w:i/>
       <w:iCs/>
@@ -1816,7 +2175,7 @@
     <w:basedOn w:val="Phngmcinhcuaoanvn"/>
     <w:uiPriority w:val="32"/>
     <w:qFormat/>
-    <w:rsid w:val="00CB13C5"/>
+    <w:rsid w:val="00D31D73"/>
     <w:rPr>
       <w:b/>
       <w:bCs/>

</xml_diff>